<commit_message>
did players class, playersList ui compnent done button
</commit_message>
<xml_diff>
--- a/BhavayWizardMaze/Patchnotes.docx
+++ b/BhavayWizardMaze/Patchnotes.docx
@@ -275,6 +275,12 @@
         </w:rPr>
         <w:t xml:space="preserve"> fix them then I would create patch note about them.</w:t>
       </w:r>
+      <w:r>
+        <w:rPr>
+          <w:lang w:val="en-IN"/>
+        </w:rPr>
+        <w:t xml:space="preserve"> </w:t>
+      </w:r>
     </w:p>
     <w:p>
       <w:pPr>
@@ -282,6 +288,26 @@
           <w:lang w:val="en-IN"/>
         </w:rPr>
       </w:pPr>
+      <w:r>
+        <w:rPr>
+          <w:lang w:val="en-IN"/>
+        </w:rPr>
+        <w:t xml:space="preserve">Git Hub </w:t>
+      </w:r>
+      <w:proofErr w:type="gramStart"/>
+      <w:r>
+        <w:rPr>
+          <w:lang w:val="en-IN"/>
+        </w:rPr>
+        <w:t>Screenshots :</w:t>
+      </w:r>
+      <w:proofErr w:type="gramEnd"/>
+      <w:r>
+        <w:rPr>
+          <w:lang w:val="en-IN"/>
+        </w:rPr>
+        <w:br/>
+      </w:r>
     </w:p>
     <w:p>
       <w:pPr>
@@ -289,26 +315,6 @@
           <w:lang w:val="en-IN"/>
         </w:rPr>
       </w:pPr>
-      <w:r>
-        <w:rPr>
-          <w:lang w:val="en-IN"/>
-        </w:rPr>
-        <w:t xml:space="preserve">Git Hub </w:t>
-      </w:r>
-      <w:proofErr w:type="gramStart"/>
-      <w:r>
-        <w:rPr>
-          <w:lang w:val="en-IN"/>
-        </w:rPr>
-        <w:t>Screenshots :</w:t>
-      </w:r>
-      <w:proofErr w:type="gramEnd"/>
-      <w:r>
-        <w:rPr>
-          <w:lang w:val="en-IN"/>
-        </w:rPr>
-        <w:br/>
-      </w:r>
     </w:p>
     <w:p>
       <w:pPr>
@@ -316,6 +322,88 @@
           <w:lang w:val="en-IN"/>
         </w:rPr>
       </w:pPr>
+      <w:r>
+        <w:rPr>
+          <w:noProof/>
+          <w:lang w:val="en-IN"/>
+        </w:rPr>
+        <w:drawing>
+          <wp:inline distT="0" distB="0" distL="0" distR="0" wp14:anchorId="29A3BCEC" wp14:editId="6910B06F">
+            <wp:extent cx="5731510" cy="3282315"/>
+            <wp:effectExtent l="0" t="0" r="2540" b="0"/>
+            <wp:docPr id="2031501633" name="Picture 1" descr="A screenshot of a computer&#10;&#10;Description automatically generated"/>
+            <wp:cNvGraphicFramePr>
+              <a:graphicFrameLocks xmlns:a="http://schemas.openxmlformats.org/drawingml/2006/main" noChangeAspect="1"/>
+            </wp:cNvGraphicFramePr>
+            <a:graphic xmlns:a="http://schemas.openxmlformats.org/drawingml/2006/main">
+              <a:graphicData uri="http://schemas.openxmlformats.org/drawingml/2006/picture">
+                <pic:pic xmlns:pic="http://schemas.openxmlformats.org/drawingml/2006/picture">
+                  <pic:nvPicPr>
+                    <pic:cNvPr id="2031501633" name="Picture 1" descr="A screenshot of a computer&#10;&#10;Description automatically generated"/>
+                    <pic:cNvPicPr/>
+                  </pic:nvPicPr>
+                  <pic:blipFill>
+                    <a:blip r:embed="rId5"/>
+                    <a:stretch>
+                      <a:fillRect/>
+                    </a:stretch>
+                  </pic:blipFill>
+                  <pic:spPr>
+                    <a:xfrm>
+                      <a:off x="0" y="0"/>
+                      <a:ext cx="5731510" cy="3282315"/>
+                    </a:xfrm>
+                    <a:prstGeom prst="rect">
+                      <a:avLst/>
+                    </a:prstGeom>
+                  </pic:spPr>
+                </pic:pic>
+              </a:graphicData>
+            </a:graphic>
+          </wp:inline>
+        </w:drawing>
+      </w:r>
+      <w:r>
+        <w:rPr>
+          <w:noProof/>
+          <w:lang w:val="en-IN"/>
+        </w:rPr>
+        <w:drawing>
+          <wp:inline distT="0" distB="0" distL="0" distR="0" wp14:anchorId="1FE90BF1" wp14:editId="4B57C091">
+            <wp:extent cx="5731510" cy="1541780"/>
+            <wp:effectExtent l="0" t="0" r="2540" b="1270"/>
+            <wp:docPr id="1776941235" name="Picture 1" descr="A screenshot of a computer program&#10;&#10;Description automatically generated"/>
+            <wp:cNvGraphicFramePr>
+              <a:graphicFrameLocks xmlns:a="http://schemas.openxmlformats.org/drawingml/2006/main" noChangeAspect="1"/>
+            </wp:cNvGraphicFramePr>
+            <a:graphic xmlns:a="http://schemas.openxmlformats.org/drawingml/2006/main">
+              <a:graphicData uri="http://schemas.openxmlformats.org/drawingml/2006/picture">
+                <pic:pic xmlns:pic="http://schemas.openxmlformats.org/drawingml/2006/picture">
+                  <pic:nvPicPr>
+                    <pic:cNvPr id="1776941235" name="Picture 1" descr="A screenshot of a computer program&#10;&#10;Description automatically generated"/>
+                    <pic:cNvPicPr/>
+                  </pic:nvPicPr>
+                  <pic:blipFill>
+                    <a:blip r:embed="rId6"/>
+                    <a:stretch>
+                      <a:fillRect/>
+                    </a:stretch>
+                  </pic:blipFill>
+                  <pic:spPr>
+                    <a:xfrm>
+                      <a:off x="0" y="0"/>
+                      <a:ext cx="5731510" cy="1541780"/>
+                    </a:xfrm>
+                    <a:prstGeom prst="rect">
+                      <a:avLst/>
+                    </a:prstGeom>
+                  </pic:spPr>
+                </pic:pic>
+              </a:graphicData>
+            </a:graphic>
+          </wp:inline>
+        </w:drawing>
+      </w:r>
     </w:p>
     <w:sectPr>
       <w:pgSz w:w="11906" w:h="16838"/>

</xml_diff>